<commit_message>
Update site visuals and sales collateral
</commit_message>
<xml_diff>
--- a/business logic/Sunforge-Digital-Sales-Playbook.docx
+++ b/business logic/Sunforge-Digital-Sales-Playbook.docx
@@ -1744,6 +1744,21 @@
           <w:iCs/>
         </w:rPr>
         <w:t xml:space="preserve">Full cost breakdown, platform tiers, and margin math live in the Pricing Reference doc — this is just what to say out loud.</w:t>
+      </w:r>
+    </w:p>
+    <w:p>
+      <w:pPr>
+        <w:spacing w:after="120"/>
+      </w:pPr>
+      <w:r>
+        <w:rPr>
+          <w:b/>
+          <w:bCs/>
+        </w:rPr>
+        <w:t xml:space="preserve">Founding client offer (first 3 only): </w:t>
+      </w:r>
+      <w:r>
+        <w:t xml:space="preserve">site build $500 flat when bundled with receptionist, or Tier 3/4 standalone setup fee waived. Show the real price crossed out. Never touch the monthly rate.</w:t>
       </w:r>
     </w:p>
     <w:p>

</xml_diff>